<commit_message>
Refine full screen book reader controls and page layout
Refine The Zion Might Book Journey reading experience by presenting the complete book pages in a large full-screen reading area, keeping the original page proportions and artwork intact, and moving the Back and Full Screen controls into a separate area outside the book so they never cover the page content. Maintain the entrance sequence with The Zion Might Presents, Volume of the Book, The Path of Life, Begin the Journey, and the separately positioned Download the Book button.
</commit_message>
<xml_diff>
--- a/VOLUME-OF-THE-BOOK-THE-PATH-OF-LIFE.docx
+++ b/VOLUME-OF-THE-BOOK-THE-PATH-OF-LIFE.docx
@@ -12,8 +12,6 @@
           <w:lang w:eastAsia="en-US"/>
         </w:rPr>
       </w:pPr>
-      <w:bookmarkStart w:id="0" w:name="_GoBack"/>
-      <w:bookmarkEnd w:id="0"/>
       <w:r>
         <w:rPr>
           <w:rFonts w:ascii="Palatino Linotype" w:hAnsi="Palatino Linotype" w:cstheme="minorHAnsi"/>
@@ -439,6 +437,7 @@
     </w:p>
     <w:p>
       <w:pPr>
+        <w:spacing w:line="480" w:lineRule="auto"/>
         <w:rPr>
           <w:rFonts w:ascii="Palatino Linotype" w:hAnsi="Palatino Linotype" w:cstheme="minorHAnsi"/>
           <w:color w:val="000000"/>
@@ -481,7 +480,7 @@
             <w:sz w:val="28"/>
             <w:szCs w:val="24"/>
           </w:rPr>
-          <w:t>Facebook @The</w:t>
+          <w:t>Faceb</w:t>
         </w:r>
         <w:r>
           <w:rPr>
@@ -490,7 +489,7 @@
             <w:sz w:val="28"/>
             <w:szCs w:val="24"/>
           </w:rPr>
-          <w:t xml:space="preserve"> </w:t>
+          <w:t>o</w:t>
         </w:r>
         <w:r>
           <w:rPr>
@@ -499,7 +498,7 @@
             <w:sz w:val="28"/>
             <w:szCs w:val="24"/>
           </w:rPr>
-          <w:t xml:space="preserve">Might </w:t>
+          <w:t>o</w:t>
         </w:r>
         <w:r>
           <w:rPr>
@@ -508,7 +507,7 @@
             <w:sz w:val="28"/>
             <w:szCs w:val="24"/>
           </w:rPr>
-          <w:t>Zion</w:t>
+          <w:t>k@</w:t>
         </w:r>
         <w:r>
           <w:rPr>
@@ -517,7 +516,7 @@
             <w:sz w:val="28"/>
             <w:szCs w:val="24"/>
           </w:rPr>
-          <w:t xml:space="preserve"> </w:t>
+          <w:t>T</w:t>
         </w:r>
         <w:r>
           <w:rPr>
@@ -526,17 +525,25 @@
             <w:sz w:val="28"/>
             <w:szCs w:val="24"/>
           </w:rPr>
-          <w:t>TV</w:t>
+          <w:t>hezionmight</w:t>
         </w:r>
       </w:hyperlink>
       <w:r>
         <w:rPr>
           <w:rFonts w:ascii="Palatino Linotype" w:hAnsi="Palatino Linotype" w:cstheme="minorHAnsi"/>
-          <w:color w:val="000000"/>
           <w:sz w:val="28"/>
           <w:szCs w:val="24"/>
         </w:rPr>
-        <w:t xml:space="preserve"> /</w:t>
+        <w:t xml:space="preserve"> </w:t>
+      </w:r>
+      <w:r>
+        <w:rPr>
+          <w:rFonts w:ascii="Palatino Linotype" w:hAnsi="Palatino Linotype" w:cstheme="minorHAnsi"/>
+          <w:color w:val="000000"/>
+          <w:sz w:val="28"/>
+          <w:szCs w:val="24"/>
+        </w:rPr>
+        <w:t>/</w:t>
       </w:r>
       <w:r>
         <w:rPr>
@@ -555,7 +562,25 @@
             <w:sz w:val="28"/>
             <w:szCs w:val="24"/>
           </w:rPr>
-          <w:t>YouTube @SowTalkNation</w:t>
+          <w:t>Yo</w:t>
+        </w:r>
+        <w:r>
+          <w:rPr>
+            <w:rStyle w:val="Hyperlink"/>
+            <w:rFonts w:ascii="Palatino Linotype" w:hAnsi="Palatino Linotype" w:cstheme="minorHAnsi"/>
+            <w:sz w:val="28"/>
+            <w:szCs w:val="24"/>
+          </w:rPr>
+          <w:t>u</w:t>
+        </w:r>
+        <w:r>
+          <w:rPr>
+            <w:rStyle w:val="Hyperlink"/>
+            <w:rFonts w:ascii="Palatino Linotype" w:hAnsi="Palatino Linotype" w:cstheme="minorHAnsi"/>
+            <w:sz w:val="28"/>
+            <w:szCs w:val="24"/>
+          </w:rPr>
+          <w:t>Tube @SowTalkNation</w:t>
         </w:r>
       </w:hyperlink>
       <w:r>
@@ -31806,9 +31831,9 @@
         </w:rPr>
         <w:drawing>
           <wp:inline distT="0" distB="0" distL="0" distR="0">
-            <wp:extent cx="7216346" cy="7760043"/>
-            <wp:effectExtent l="0" t="0" r="3810" b="0"/>
-            <wp:docPr id="3" name="Picture 3"/>
+            <wp:extent cx="7246500" cy="8120743"/>
+            <wp:effectExtent l="0" t="0" r="0" b="0"/>
+            <wp:docPr id="4" name="Picture 4"/>
             <wp:cNvGraphicFramePr>
               <a:graphicFrameLocks xmlns:a="http://schemas.openxmlformats.org/drawingml/2006/main" noChangeAspect="1"/>
             </wp:cNvGraphicFramePr>
@@ -31816,7 +31841,7 @@
               <a:graphicData uri="http://schemas.openxmlformats.org/drawingml/2006/picture">
                 <pic:pic xmlns:pic="http://schemas.openxmlformats.org/drawingml/2006/picture">
                   <pic:nvPicPr>
-                    <pic:cNvPr id="0" name="Picsart_26-08-27_11-30-21-268 (1).jpg"/>
+                    <pic:cNvPr id="0" name="Picsart_26-09-11_13-10-18-002.jpg"/>
                     <pic:cNvPicPr/>
                   </pic:nvPicPr>
                   <pic:blipFill>
@@ -31834,7 +31859,7 @@
                   <pic:spPr>
                     <a:xfrm>
                       <a:off x="0" y="0"/>
-                      <a:ext cx="7216346" cy="7760043"/>
+                      <a:ext cx="7249886" cy="8124537"/>
                     </a:xfrm>
                     <a:prstGeom prst="rect">
                       <a:avLst/>
@@ -31846,6 +31871,8 @@
           </wp:inline>
         </w:drawing>
       </w:r>
+      <w:bookmarkStart w:id="0" w:name="_GoBack"/>
+      <w:bookmarkEnd w:id="0"/>
     </w:p>
     <w:sectPr>
       <w:headerReference w:type="default" r:id="rId14"/>
@@ -35557,7 +35584,7 @@
 </file>
 
 <file path=customXml/itemProps1.xml><?xml version="1.0" encoding="utf-8"?>
-<ds:datastoreItem xmlns:ds="http://schemas.openxmlformats.org/officeDocument/2006/customXml" ds:itemID="{9DC6563A-5E1F-46FC-8B9C-1E474049639A}">
+<ds:datastoreItem xmlns:ds="http://schemas.openxmlformats.org/officeDocument/2006/customXml" ds:itemID="{69241B16-A2C7-4D7B-92DB-318FEB0D82A2}">
   <ds:schemaRefs>
     <ds:schemaRef ds:uri="http://schemas.openxmlformats.org/officeDocument/2006/bibliography"/>
   </ds:schemaRefs>

</xml_diff>

<commit_message>
Replace the page-by-page book flipping experience with a continuous scrolling
Replace the page-by-page book flipping experience with a continuous scrolling online reading experience. Present each complete original book page in sequence at a large readable size while preserving the original page proportions, artwork, typography, and content. Keep the Back and Full Screen controls in a separate control area outside the book so they do not cover the page content, while maintaining the existing entrance layout and Download the Book option.
</commit_message>
<xml_diff>
--- a/VOLUME-OF-THE-BOOK-THE-PATH-OF-LIFE.docx
+++ b/VOLUME-OF-THE-BOOK-THE-PATH-OF-LIFE.docx
@@ -12,6 +12,8 @@
           <w:lang w:eastAsia="en-US"/>
         </w:rPr>
       </w:pPr>
+      <w:bookmarkStart w:id="0" w:name="_GoBack"/>
+      <w:bookmarkEnd w:id="0"/>
       <w:r>
         <w:rPr>
           <w:rFonts w:ascii="Palatino Linotype" w:hAnsi="Palatino Linotype" w:cstheme="minorHAnsi"/>
@@ -437,7 +439,6 @@
     </w:p>
     <w:p>
       <w:pPr>
-        <w:spacing w:line="480" w:lineRule="auto"/>
         <w:rPr>
           <w:rFonts w:ascii="Palatino Linotype" w:hAnsi="Palatino Linotype" w:cstheme="minorHAnsi"/>
           <w:color w:val="000000"/>
@@ -480,7 +481,7 @@
             <w:sz w:val="28"/>
             <w:szCs w:val="24"/>
           </w:rPr>
-          <w:t>Faceb</w:t>
+          <w:t>Facebook @The</w:t>
         </w:r>
         <w:r>
           <w:rPr>
@@ -489,7 +490,7 @@
             <w:sz w:val="28"/>
             <w:szCs w:val="24"/>
           </w:rPr>
-          <w:t>o</w:t>
+          <w:t xml:space="preserve"> </w:t>
         </w:r>
         <w:r>
           <w:rPr>
@@ -498,7 +499,7 @@
             <w:sz w:val="28"/>
             <w:szCs w:val="24"/>
           </w:rPr>
-          <w:t>o</w:t>
+          <w:t xml:space="preserve">Might </w:t>
         </w:r>
         <w:r>
           <w:rPr>
@@ -507,7 +508,7 @@
             <w:sz w:val="28"/>
             <w:szCs w:val="24"/>
           </w:rPr>
-          <w:t>k@</w:t>
+          <w:t>Zion</w:t>
         </w:r>
         <w:r>
           <w:rPr>
@@ -516,7 +517,7 @@
             <w:sz w:val="28"/>
             <w:szCs w:val="24"/>
           </w:rPr>
-          <w:t>T</w:t>
+          <w:t xml:space="preserve"> </w:t>
         </w:r>
         <w:r>
           <w:rPr>
@@ -525,25 +526,17 @@
             <w:sz w:val="28"/>
             <w:szCs w:val="24"/>
           </w:rPr>
-          <w:t>hezionmight</w:t>
+          <w:t>TV</w:t>
         </w:r>
       </w:hyperlink>
       <w:r>
         <w:rPr>
           <w:rFonts w:ascii="Palatino Linotype" w:hAnsi="Palatino Linotype" w:cstheme="minorHAnsi"/>
+          <w:color w:val="000000"/>
           <w:sz w:val="28"/>
           <w:szCs w:val="24"/>
         </w:rPr>
-        <w:t xml:space="preserve"> </w:t>
-      </w:r>
-      <w:r>
-        <w:rPr>
-          <w:rFonts w:ascii="Palatino Linotype" w:hAnsi="Palatino Linotype" w:cstheme="minorHAnsi"/>
-          <w:color w:val="000000"/>
-          <w:sz w:val="28"/>
-          <w:szCs w:val="24"/>
-        </w:rPr>
-        <w:t>/</w:t>
+        <w:t xml:space="preserve"> /</w:t>
       </w:r>
       <w:r>
         <w:rPr>
@@ -562,25 +555,7 @@
             <w:sz w:val="28"/>
             <w:szCs w:val="24"/>
           </w:rPr>
-          <w:t>Yo</w:t>
-        </w:r>
-        <w:r>
-          <w:rPr>
-            <w:rStyle w:val="Hyperlink"/>
-            <w:rFonts w:ascii="Palatino Linotype" w:hAnsi="Palatino Linotype" w:cstheme="minorHAnsi"/>
-            <w:sz w:val="28"/>
-            <w:szCs w:val="24"/>
-          </w:rPr>
-          <w:t>u</w:t>
-        </w:r>
-        <w:r>
-          <w:rPr>
-            <w:rStyle w:val="Hyperlink"/>
-            <w:rFonts w:ascii="Palatino Linotype" w:hAnsi="Palatino Linotype" w:cstheme="minorHAnsi"/>
-            <w:sz w:val="28"/>
-            <w:szCs w:val="24"/>
-          </w:rPr>
-          <w:t>Tube @SowTalkNation</w:t>
+          <w:t>YouTube @SowTalkNation</w:t>
         </w:r>
       </w:hyperlink>
       <w:r>
@@ -31831,9 +31806,9 @@
         </w:rPr>
         <w:drawing>
           <wp:inline distT="0" distB="0" distL="0" distR="0">
-            <wp:extent cx="7246500" cy="8120743"/>
-            <wp:effectExtent l="0" t="0" r="0" b="0"/>
-            <wp:docPr id="4" name="Picture 4"/>
+            <wp:extent cx="7216346" cy="7760043"/>
+            <wp:effectExtent l="0" t="0" r="3810" b="0"/>
+            <wp:docPr id="3" name="Picture 3"/>
             <wp:cNvGraphicFramePr>
               <a:graphicFrameLocks xmlns:a="http://schemas.openxmlformats.org/drawingml/2006/main" noChangeAspect="1"/>
             </wp:cNvGraphicFramePr>
@@ -31841,7 +31816,7 @@
               <a:graphicData uri="http://schemas.openxmlformats.org/drawingml/2006/picture">
                 <pic:pic xmlns:pic="http://schemas.openxmlformats.org/drawingml/2006/picture">
                   <pic:nvPicPr>
-                    <pic:cNvPr id="0" name="Picsart_26-09-11_13-10-18-002.jpg"/>
+                    <pic:cNvPr id="0" name="Picsart_26-08-27_11-30-21-268 (1).jpg"/>
                     <pic:cNvPicPr/>
                   </pic:nvPicPr>
                   <pic:blipFill>
@@ -31859,7 +31834,7 @@
                   <pic:spPr>
                     <a:xfrm>
                       <a:off x="0" y="0"/>
-                      <a:ext cx="7249886" cy="8124537"/>
+                      <a:ext cx="7216346" cy="7760043"/>
                     </a:xfrm>
                     <a:prstGeom prst="rect">
                       <a:avLst/>
@@ -31871,8 +31846,6 @@
           </wp:inline>
         </w:drawing>
       </w:r>
-      <w:bookmarkStart w:id="0" w:name="_GoBack"/>
-      <w:bookmarkEnd w:id="0"/>
     </w:p>
     <w:sectPr>
       <w:headerReference w:type="default" r:id="rId14"/>
@@ -35584,7 +35557,7 @@
 </file>
 
 <file path=customXml/itemProps1.xml><?xml version="1.0" encoding="utf-8"?>
-<ds:datastoreItem xmlns:ds="http://schemas.openxmlformats.org/officeDocument/2006/customXml" ds:itemID="{69241B16-A2C7-4D7B-92DB-318FEB0D82A2}">
+<ds:datastoreItem xmlns:ds="http://schemas.openxmlformats.org/officeDocument/2006/customXml" ds:itemID="{9DC6563A-5E1F-46FC-8B9C-1E474049639A}">
   <ds:schemaRefs>
     <ds:schemaRef ds:uri="http://schemas.openxmlformats.org/officeDocument/2006/bibliography"/>
   </ds:schemaRefs>

</xml_diff>

<commit_message>
Upgrade book reader full screen 3D page fliping
Replaced the flat book navigation with a full-screen 3D page-flipping experience designed to feel more like turning real book pages. Added realistic page depth, perspective, shadows, and smooth page-turn animation while maintaining responsive full-screen viewing across mobile, tablet, and desktop devices.
</commit_message>
<xml_diff>
--- a/VOLUME-OF-THE-BOOK-THE-PATH-OF-LIFE.docx
+++ b/VOLUME-OF-THE-BOOK-THE-PATH-OF-LIFE.docx
@@ -12,6 +12,8 @@
           <w:lang w:eastAsia="en-US"/>
         </w:rPr>
       </w:pPr>
+      <w:bookmarkStart w:id="0" w:name="_GoBack"/>
+      <w:bookmarkEnd w:id="0"/>
       <w:r>
         <w:rPr>
           <w:rFonts w:ascii="Palatino Linotype" w:hAnsi="Palatino Linotype" w:cstheme="minorHAnsi"/>
@@ -437,7 +439,6 @@
     </w:p>
     <w:p>
       <w:pPr>
-        <w:spacing w:line="480" w:lineRule="auto"/>
         <w:rPr>
           <w:rFonts w:ascii="Palatino Linotype" w:hAnsi="Palatino Linotype" w:cstheme="minorHAnsi"/>
           <w:color w:val="000000"/>
@@ -480,7 +481,7 @@
             <w:sz w:val="28"/>
             <w:szCs w:val="24"/>
           </w:rPr>
-          <w:t>Faceb</w:t>
+          <w:t>Facebook @The</w:t>
         </w:r>
         <w:r>
           <w:rPr>
@@ -489,7 +490,7 @@
             <w:sz w:val="28"/>
             <w:szCs w:val="24"/>
           </w:rPr>
-          <w:t>o</w:t>
+          <w:t xml:space="preserve"> </w:t>
         </w:r>
         <w:r>
           <w:rPr>
@@ -498,7 +499,7 @@
             <w:sz w:val="28"/>
             <w:szCs w:val="24"/>
           </w:rPr>
-          <w:t>o</w:t>
+          <w:t xml:space="preserve">Might </w:t>
         </w:r>
         <w:r>
           <w:rPr>
@@ -507,7 +508,7 @@
             <w:sz w:val="28"/>
             <w:szCs w:val="24"/>
           </w:rPr>
-          <w:t>k@</w:t>
+          <w:t>Zion</w:t>
         </w:r>
         <w:r>
           <w:rPr>
@@ -516,7 +517,7 @@
             <w:sz w:val="28"/>
             <w:szCs w:val="24"/>
           </w:rPr>
-          <w:t>T</w:t>
+          <w:t xml:space="preserve"> </w:t>
         </w:r>
         <w:r>
           <w:rPr>
@@ -525,25 +526,17 @@
             <w:sz w:val="28"/>
             <w:szCs w:val="24"/>
           </w:rPr>
-          <w:t>hezionmight</w:t>
+          <w:t>TV</w:t>
         </w:r>
       </w:hyperlink>
       <w:r>
         <w:rPr>
           <w:rFonts w:ascii="Palatino Linotype" w:hAnsi="Palatino Linotype" w:cstheme="minorHAnsi"/>
+          <w:color w:val="000000"/>
           <w:sz w:val="28"/>
           <w:szCs w:val="24"/>
         </w:rPr>
-        <w:t xml:space="preserve"> </w:t>
-      </w:r>
-      <w:r>
-        <w:rPr>
-          <w:rFonts w:ascii="Palatino Linotype" w:hAnsi="Palatino Linotype" w:cstheme="minorHAnsi"/>
-          <w:color w:val="000000"/>
-          <w:sz w:val="28"/>
-          <w:szCs w:val="24"/>
-        </w:rPr>
-        <w:t>/</w:t>
+        <w:t xml:space="preserve"> /</w:t>
       </w:r>
       <w:r>
         <w:rPr>
@@ -562,25 +555,7 @@
             <w:sz w:val="28"/>
             <w:szCs w:val="24"/>
           </w:rPr>
-          <w:t>Yo</w:t>
-        </w:r>
-        <w:r>
-          <w:rPr>
-            <w:rStyle w:val="Hyperlink"/>
-            <w:rFonts w:ascii="Palatino Linotype" w:hAnsi="Palatino Linotype" w:cstheme="minorHAnsi"/>
-            <w:sz w:val="28"/>
-            <w:szCs w:val="24"/>
-          </w:rPr>
-          <w:t>u</w:t>
-        </w:r>
-        <w:r>
-          <w:rPr>
-            <w:rStyle w:val="Hyperlink"/>
-            <w:rFonts w:ascii="Palatino Linotype" w:hAnsi="Palatino Linotype" w:cstheme="minorHAnsi"/>
-            <w:sz w:val="28"/>
-            <w:szCs w:val="24"/>
-          </w:rPr>
-          <w:t>Tube @SowTalkNation</w:t>
+          <w:t>YouTube @SowTalkNation</w:t>
         </w:r>
       </w:hyperlink>
       <w:r>
@@ -31831,9 +31806,9 @@
         </w:rPr>
         <w:drawing>
           <wp:inline distT="0" distB="0" distL="0" distR="0">
-            <wp:extent cx="7246500" cy="8120743"/>
-            <wp:effectExtent l="0" t="0" r="0" b="0"/>
-            <wp:docPr id="4" name="Picture 4"/>
+            <wp:extent cx="7216346" cy="7760043"/>
+            <wp:effectExtent l="0" t="0" r="3810" b="0"/>
+            <wp:docPr id="3" name="Picture 3"/>
             <wp:cNvGraphicFramePr>
               <a:graphicFrameLocks xmlns:a="http://schemas.openxmlformats.org/drawingml/2006/main" noChangeAspect="1"/>
             </wp:cNvGraphicFramePr>
@@ -31841,7 +31816,7 @@
               <a:graphicData uri="http://schemas.openxmlformats.org/drawingml/2006/picture">
                 <pic:pic xmlns:pic="http://schemas.openxmlformats.org/drawingml/2006/picture">
                   <pic:nvPicPr>
-                    <pic:cNvPr id="0" name="Picsart_26-09-11_13-10-18-002.jpg"/>
+                    <pic:cNvPr id="0" name="Picsart_26-08-27_11-30-21-268 (1).jpg"/>
                     <pic:cNvPicPr/>
                   </pic:nvPicPr>
                   <pic:blipFill>
@@ -31859,7 +31834,7 @@
                   <pic:spPr>
                     <a:xfrm>
                       <a:off x="0" y="0"/>
-                      <a:ext cx="7249886" cy="8124537"/>
+                      <a:ext cx="7216346" cy="7760043"/>
                     </a:xfrm>
                     <a:prstGeom prst="rect">
                       <a:avLst/>
@@ -31871,8 +31846,6 @@
           </wp:inline>
         </w:drawing>
       </w:r>
-      <w:bookmarkStart w:id="0" w:name="_GoBack"/>
-      <w:bookmarkEnd w:id="0"/>
     </w:p>
     <w:sectPr>
       <w:headerReference w:type="default" r:id="rId14"/>
@@ -35584,7 +35557,7 @@
 </file>
 
 <file path=customXml/itemProps1.xml><?xml version="1.0" encoding="utf-8"?>
-<ds:datastoreItem xmlns:ds="http://schemas.openxmlformats.org/officeDocument/2006/customXml" ds:itemID="{69241B16-A2C7-4D7B-92DB-318FEB0D82A2}">
+<ds:datastoreItem xmlns:ds="http://schemas.openxmlformats.org/officeDocument/2006/customXml" ds:itemID="{9DC6563A-5E1F-46FC-8B9C-1E474049639A}">
   <ds:schemaRefs>
     <ds:schemaRef ds:uri="http://schemas.openxmlformats.org/officeDocument/2006/bibliography"/>
   </ds:schemaRefs>

</xml_diff>